<commit_message>
Reader report: finish the Master's template mapping (header + Standards 1-18)
The Master's reader-report template was using the procedural fallback for its
header — its institution/program name never filled because the header is one
tab-delimited paragraph with several labels and the prep script skipped it
(no_header). Verified docx.patchDocument replaces tokens INLINE, so the prep
script now inserts {{inst_name}}/{{prog_name}} after their labels without
clobbering the others. masters.docx regenerated; all three levels are now fully
template-driven. Stale 'masters has no template' comments updated.

Tests: readerReportMasters.test.ts — template is fully tagged (header + c/n/cm
for Standards 1-18) AND a full patchDocument fill yields the names, marks, and
NO leftover tokens.

Co-Authored-By: Claude Opus 4.8 <noreply@anthropic.com>
</commit_message>
<xml_diff>
--- a/CSHSE/server/src/assets/reader-report-templates/masters.docx
+++ b/CSHSE/server/src/assets/reader-report-templates/masters.docx
@@ -164,171 +164,31 @@
           <w:sz w:val="20"/>
         </w:rPr>
       </w:pPr>
-      <w:r>
-        <w:rPr>
-          <w:b/>
-          <w:sz w:val="20"/>
-        </w:rPr>
-        <w:t xml:space="preserve">Institution’s Name: </w:t>
-      </w:r>
-      <w:r>
-        <w:rPr>
-          <w:b/>
-          <w:sz w:val="20"/>
-          <w:u w:val="thick"/>
-        </w:rPr>
-        <w:tab/>
-      </w:r>
-      <w:r>
-        <w:rPr>
-          <w:b/>
-          <w:sz w:val="20"/>
-          <w:u w:val="thick"/>
-        </w:rPr>
-        <w:tab/>
-      </w:r>
-      <w:r>
-        <w:rPr>
-          <w:b/>
-          <w:sz w:val="20"/>
-          <w:u w:val="thick"/>
-        </w:rPr>
-        <w:tab/>
-      </w:r>
-      <w:r>
-        <w:rPr>
-          <w:b/>
-          <w:sz w:val="20"/>
-          <w:u w:val="thick"/>
-        </w:rPr>
-        <w:tab/>
-      </w:r>
-      <w:r>
-        <w:rPr>
-          <w:b/>
-          <w:sz w:val="20"/>
-        </w:rPr>
-        <w:t xml:space="preserve"> Program’s Name: </w:t>
-      </w:r>
-      <w:r>
-        <w:rPr>
-          <w:b/>
-          <w:sz w:val="20"/>
-          <w:u w:val="thick"/>
-        </w:rPr>
-        <w:tab/>
-      </w:r>
-      <w:r>
-        <w:rPr>
-          <w:b/>
-          <w:sz w:val="20"/>
-          <w:u w:val="thick"/>
-        </w:rPr>
-        <w:tab/>
-      </w:r>
-      <w:r>
-        <w:rPr>
-          <w:b/>
-          <w:sz w:val="20"/>
-          <w:u w:val="thick"/>
-        </w:rPr>
-        <w:tab/>
-      </w:r>
-      <w:r>
-        <w:rPr>
-          <w:b/>
-          <w:sz w:val="20"/>
-        </w:rPr>
-        <w:t xml:space="preserve"> Program Director’s/Coordinator’s Name</w:t>
-      </w:r>
-      <w:r>
-        <w:rPr>
-          <w:sz w:val="20"/>
-          <w:u w:val="thick"/>
-        </w:rPr>
-        <w:tab/>
-      </w:r>
-      <w:r>
-        <w:rPr>
-          <w:sz w:val="20"/>
-          <w:u w:val="thick"/>
-        </w:rPr>
-        <w:tab/>
-      </w:r>
-      <w:r>
-        <w:rPr>
-          <w:sz w:val="20"/>
-        </w:rPr>
-        <w:t xml:space="preserve"> </w:t>
-      </w:r>
-      <w:r>
-        <w:rPr>
-          <w:b/>
-          <w:sz w:val="20"/>
-        </w:rPr>
-        <w:t>Reader’s Name and Credential</w:t>
-      </w:r>
       <w:proofErr w:type="gramStart"/>
-      <w:r>
-        <w:rPr>
-          <w:b/>
-          <w:sz w:val="20"/>
-        </w:rPr>
-        <w:t xml:space="preserve">: </w:t>
-      </w:r>
-      <w:r>
-        <w:rPr>
-          <w:b/>
-          <w:sz w:val="20"/>
-          <w:u w:val="thick"/>
-        </w:rPr>
-        <w:tab/>
-      </w:r>
-      <w:r>
-        <w:rPr>
-          <w:b/>
-          <w:sz w:val="20"/>
-        </w:rPr>
-        <w:t>Date</w:t>
-      </w:r>
       <w:proofErr w:type="gramEnd"/>
       <w:r>
         <w:rPr>
           <w:b/>
           <w:sz w:val="20"/>
         </w:rPr>
-        <w:t xml:space="preserve">: </w:t>
-      </w:r>
-      <w:r>
-        <w:rPr>
-          <w:b/>
-          <w:sz w:val="20"/>
-          <w:u w:val="thick"/>
-        </w:rPr>
+        <w:t xml:space="preserve">Institution’s Name: {{inst_name}} </w:t>
         <w:tab/>
-      </w:r>
-      <w:r>
-        <w:rPr>
-          <w:b/>
-          <w:sz w:val="20"/>
-          <w:u w:val="thick"/>
-        </w:rPr>
         <w:tab/>
-      </w:r>
-      <w:r>
-        <w:rPr>
-          <w:b/>
-          <w:sz w:val="20"/>
-          <w:u w:val="thick"/>
-        </w:rPr>
         <w:tab/>
-      </w:r>
-      <w:r>
-        <w:rPr>
-          <w:b/>
-          <w:sz w:val="20"/>
-          <w:u w:val="thick"/>
-        </w:rPr>
+        <w:tab/>
+        <w:t xml:space="preserve"> Program’s Name: {{prog_name}} </w:t>
+        <w:tab/>
+        <w:tab/>
+        <w:tab/>
+        <w:t xml:space="preserve"> Program Director’s/Coordinator’s Name</w:t>
+        <w:tab/>
+        <w:tab/>
+        <w:t xml:space="preserve"> Reader’s Name and Credential: </w:t>
+        <w:tab/>
+        <w:t xml:space="preserve">Date: </w:t>
+        <w:tab/>
+        <w:tab/>
+        <w:tab/>
         <w:tab/>
       </w:r>
     </w:p>

</xml_diff>